<commit_message>
Added Board and GitHub links to doc
</commit_message>
<xml_diff>
--- a/2026 NHL Draft Notes.docx
+++ b/2026 NHL Draft Notes.docx
@@ -72,6 +72,69 @@
     </w:p>
     <w:p>
       <w:pPr>
+        <w:spacing w:after="120" w:lineRule="auto"/>
+        <w:rPr/>
+      </w:pPr>
+      <w:r>
+        <w:rPr>
+          <w:rtl w:val="0"/>
+        </w:rPr>
+        <w:t xml:space="preserve">Link to Interactive Draft Board: </w:t>
+      </w:r>
+      <w:hyperlink r:id="rId6">
+        <w:r>
+          <w:rPr>
+            <w:u w:val="single"/>
+            <w:rtl w:val="0"/>
+          </w:rPr>
+          <w:t xml:space="preserve">Board</w:t>
+        </w:r>
+      </w:hyperlink>
+      <w:r>
+        <w:rPr>
+          <w:rtl w:val="0"/>
+        </w:rPr>
+      </w:r>
+    </w:p>
+    <w:p>
+      <w:pPr>
+        <w:spacing w:after="120" w:lineRule="auto"/>
+        <w:rPr/>
+      </w:pPr>
+      <w:r>
+        <w:rPr>
+          <w:rtl w:val="0"/>
+        </w:rPr>
+      </w:r>
+    </w:p>
+    <w:p>
+      <w:pPr>
+        <w:spacing w:after="120" w:lineRule="auto"/>
+        <w:rPr/>
+      </w:pPr>
+      <w:r>
+        <w:rPr>
+          <w:rtl w:val="0"/>
+        </w:rPr>
+        <w:t xml:space="preserve">Link to GitHub Repo (with these notes being in easier to read MD file): </w:t>
+      </w:r>
+      <w:hyperlink r:id="rId7">
+        <w:r>
+          <w:rPr>
+            <w:u w:val="single"/>
+            <w:rtl w:val="0"/>
+          </w:rPr>
+          <w:t xml:space="preserve">GitHub</w:t>
+        </w:r>
+      </w:hyperlink>
+      <w:r>
+        <w:rPr>
+          <w:rtl w:val="0"/>
+        </w:rPr>
+      </w:r>
+    </w:p>
+    <w:p>
+      <w:pPr>
         <w:spacing w:after="220" w:lineRule="auto"/>
         <w:rPr/>
       </w:pPr>
@@ -208,7 +271,7 @@
         </w:rPr>
         <w:t xml:space="preserve">Sources: </w:t>
       </w:r>
-      <w:hyperlink r:id="rId6">
+      <w:hyperlink r:id="rId8">
         <w:r>
           <w:rPr>
             <w:u w:val="single"/>
@@ -223,7 +286,7 @@
         </w:rPr>
         <w:t xml:space="preserve">  ·  </w:t>
       </w:r>
-      <w:hyperlink r:id="rId7">
+      <w:hyperlink r:id="rId9">
         <w:r>
           <w:rPr>
             <w:u w:val="single"/>
@@ -238,7 +301,7 @@
         </w:rPr>
         <w:t xml:space="preserve">  ·  </w:t>
       </w:r>
-      <w:hyperlink r:id="rId8">
+      <w:hyperlink r:id="rId10">
         <w:r>
           <w:rPr>
             <w:u w:val="single"/>
@@ -393,7 +456,7 @@
         </w:rPr>
         <w:t xml:space="preserve">Sources: </w:t>
       </w:r>
-      <w:hyperlink r:id="rId9">
+      <w:hyperlink r:id="rId11">
         <w:r>
           <w:rPr>
             <w:u w:val="single"/>
@@ -408,7 +471,7 @@
         </w:rPr>
         <w:t xml:space="preserve">  ·  </w:t>
       </w:r>
-      <w:hyperlink r:id="rId10">
+      <w:hyperlink r:id="rId12">
         <w:r>
           <w:rPr>
             <w:u w:val="single"/>
@@ -423,7 +486,7 @@
         </w:rPr>
         <w:t xml:space="preserve">  ·  </w:t>
       </w:r>
-      <w:hyperlink r:id="rId11">
+      <w:hyperlink r:id="rId13">
         <w:r>
           <w:rPr>
             <w:u w:val="single"/>
@@ -576,7 +639,7 @@
         </w:rPr>
         <w:t xml:space="preserve">Sources: </w:t>
       </w:r>
-      <w:hyperlink r:id="rId12">
+      <w:hyperlink r:id="rId14">
         <w:r>
           <w:rPr>
             <w:u w:val="single"/>
@@ -591,7 +654,7 @@
         </w:rPr>
         <w:t xml:space="preserve">  ·  </w:t>
       </w:r>
-      <w:hyperlink r:id="rId13">
+      <w:hyperlink r:id="rId15">
         <w:r>
           <w:rPr>
             <w:u w:val="single"/>
@@ -606,7 +669,7 @@
         </w:rPr>
         <w:t xml:space="preserve">  ·  </w:t>
       </w:r>
-      <w:hyperlink r:id="rId14">
+      <w:hyperlink r:id="rId16">
         <w:r>
           <w:rPr>
             <w:u w:val="single"/>
@@ -761,7 +824,7 @@
         </w:rPr>
         <w:t xml:space="preserve">Sources: </w:t>
       </w:r>
-      <w:hyperlink r:id="rId15">
+      <w:hyperlink r:id="rId17">
         <w:r>
           <w:rPr>
             <w:u w:val="single"/>
@@ -776,7 +839,7 @@
         </w:rPr>
         <w:t xml:space="preserve">  ·  </w:t>
       </w:r>
-      <w:hyperlink r:id="rId16">
+      <w:hyperlink r:id="rId18">
         <w:r>
           <w:rPr>
             <w:u w:val="single"/>
@@ -791,7 +854,7 @@
         </w:rPr>
         <w:t xml:space="preserve">  ·  </w:t>
       </w:r>
-      <w:hyperlink r:id="rId17">
+      <w:hyperlink r:id="rId19">
         <w:r>
           <w:rPr>
             <w:u w:val="single"/>
@@ -944,7 +1007,7 @@
         </w:rPr>
         <w:t xml:space="preserve">Sources: </w:t>
       </w:r>
-      <w:hyperlink r:id="rId18">
+      <w:hyperlink r:id="rId20">
         <w:r>
           <w:rPr>
             <w:u w:val="single"/>
@@ -959,7 +1022,7 @@
         </w:rPr>
         <w:t xml:space="preserve">  ·  </w:t>
       </w:r>
-      <w:hyperlink r:id="rId19">
+      <w:hyperlink r:id="rId21">
         <w:r>
           <w:rPr>
             <w:u w:val="single"/>
@@ -974,7 +1037,7 @@
         </w:rPr>
         <w:t xml:space="preserve">  ·  </w:t>
       </w:r>
-      <w:hyperlink r:id="rId20">
+      <w:hyperlink r:id="rId22">
         <w:r>
           <w:rPr>
             <w:u w:val="single"/>
@@ -1129,7 +1192,7 @@
         </w:rPr>
         <w:t xml:space="preserve">Sources: </w:t>
       </w:r>
-      <w:hyperlink r:id="rId21">
+      <w:hyperlink r:id="rId23">
         <w:r>
           <w:rPr>
             <w:u w:val="single"/>
@@ -1144,7 +1207,7 @@
         </w:rPr>
         <w:t xml:space="preserve">  ·  </w:t>
       </w:r>
-      <w:hyperlink r:id="rId22">
+      <w:hyperlink r:id="rId24">
         <w:r>
           <w:rPr>
             <w:u w:val="single"/>
@@ -1159,7 +1222,7 @@
         </w:rPr>
         <w:t xml:space="preserve">  ·  </w:t>
       </w:r>
-      <w:hyperlink r:id="rId23">
+      <w:hyperlink r:id="rId25">
         <w:r>
           <w:rPr>
             <w:u w:val="single"/>
@@ -1312,7 +1375,7 @@
         </w:rPr>
         <w:t xml:space="preserve">Sources: </w:t>
       </w:r>
-      <w:hyperlink r:id="rId24">
+      <w:hyperlink r:id="rId26">
         <w:r>
           <w:rPr>
             <w:u w:val="single"/>
@@ -1327,7 +1390,7 @@
         </w:rPr>
         <w:t xml:space="preserve">  ·  </w:t>
       </w:r>
-      <w:hyperlink r:id="rId25">
+      <w:hyperlink r:id="rId27">
         <w:r>
           <w:rPr>
             <w:u w:val="single"/>
@@ -1342,7 +1405,7 @@
         </w:rPr>
         <w:t xml:space="preserve">  ·  </w:t>
       </w:r>
-      <w:hyperlink r:id="rId26">
+      <w:hyperlink r:id="rId28">
         <w:r>
           <w:rPr>
             <w:u w:val="single"/>
@@ -1513,7 +1576,7 @@
         </w:rPr>
         <w:t xml:space="preserve">Sources: </w:t>
       </w:r>
-      <w:hyperlink r:id="rId27">
+      <w:hyperlink r:id="rId29">
         <w:r>
           <w:rPr>
             <w:u w:val="single"/>
@@ -1528,7 +1591,7 @@
         </w:rPr>
         <w:t xml:space="preserve">  ·  </w:t>
       </w:r>
-      <w:hyperlink r:id="rId28">
+      <w:hyperlink r:id="rId30">
         <w:r>
           <w:rPr>
             <w:u w:val="single"/>
@@ -1543,7 +1606,7 @@
         </w:rPr>
         <w:t xml:space="preserve">  ·  </w:t>
       </w:r>
-      <w:hyperlink r:id="rId29">
+      <w:hyperlink r:id="rId31">
         <w:r>
           <w:rPr>
             <w:u w:val="single"/>
@@ -1698,7 +1761,7 @@
         </w:rPr>
         <w:t xml:space="preserve">Sources: </w:t>
       </w:r>
-      <w:hyperlink r:id="rId30">
+      <w:hyperlink r:id="rId32">
         <w:r>
           <w:rPr>
             <w:u w:val="single"/>
@@ -1713,7 +1776,7 @@
         </w:rPr>
         <w:t xml:space="preserve">  ·  </w:t>
       </w:r>
-      <w:hyperlink r:id="rId31">
+      <w:hyperlink r:id="rId33">
         <w:r>
           <w:rPr>
             <w:u w:val="single"/>
@@ -1728,7 +1791,7 @@
         </w:rPr>
         <w:t xml:space="preserve">  ·  </w:t>
       </w:r>
-      <w:hyperlink r:id="rId32">
+      <w:hyperlink r:id="rId34">
         <w:r>
           <w:rPr>
             <w:u w:val="single"/>
@@ -1881,7 +1944,7 @@
         </w:rPr>
         <w:t xml:space="preserve">Sources: </w:t>
       </w:r>
-      <w:hyperlink r:id="rId33">
+      <w:hyperlink r:id="rId35">
         <w:r>
           <w:rPr>
             <w:u w:val="single"/>
@@ -1896,7 +1959,7 @@
         </w:rPr>
         <w:t xml:space="preserve">  ·  </w:t>
       </w:r>
-      <w:hyperlink r:id="rId34">
+      <w:hyperlink r:id="rId36">
         <w:r>
           <w:rPr>
             <w:u w:val="single"/>
@@ -1911,7 +1974,7 @@
         </w:rPr>
         <w:t xml:space="preserve">  ·  </w:t>
       </w:r>
-      <w:hyperlink r:id="rId35">
+      <w:hyperlink r:id="rId37">
         <w:r>
           <w:rPr>
             <w:u w:val="single"/>
@@ -2064,7 +2127,7 @@
         </w:rPr>
         <w:t xml:space="preserve">Sources: </w:t>
       </w:r>
-      <w:hyperlink r:id="rId36">
+      <w:hyperlink r:id="rId38">
         <w:r>
           <w:rPr>
             <w:u w:val="single"/>
@@ -2079,7 +2142,7 @@
         </w:rPr>
         <w:t xml:space="preserve">  ·  </w:t>
       </w:r>
-      <w:hyperlink r:id="rId37">
+      <w:hyperlink r:id="rId39">
         <w:r>
           <w:rPr>
             <w:u w:val="single"/>
@@ -2094,7 +2157,7 @@
         </w:rPr>
         <w:t xml:space="preserve">  ·  </w:t>
       </w:r>
-      <w:hyperlink r:id="rId38">
+      <w:hyperlink r:id="rId40">
         <w:r>
           <w:rPr>
             <w:u w:val="single"/>
@@ -2247,7 +2310,7 @@
         </w:rPr>
         <w:t xml:space="preserve">Sources: </w:t>
       </w:r>
-      <w:hyperlink r:id="rId39">
+      <w:hyperlink r:id="rId41">
         <w:r>
           <w:rPr>
             <w:u w:val="single"/>
@@ -2262,7 +2325,7 @@
         </w:rPr>
         <w:t xml:space="preserve">  ·  </w:t>
       </w:r>
-      <w:hyperlink r:id="rId40">
+      <w:hyperlink r:id="rId42">
         <w:r>
           <w:rPr>
             <w:u w:val="single"/>
@@ -2277,7 +2340,7 @@
         </w:rPr>
         <w:t xml:space="preserve">  ·  </w:t>
       </w:r>
-      <w:hyperlink r:id="rId41">
+      <w:hyperlink r:id="rId43">
         <w:r>
           <w:rPr>
             <w:u w:val="single"/>
@@ -2430,7 +2493,7 @@
         </w:rPr>
         <w:t xml:space="preserve">Sources: </w:t>
       </w:r>
-      <w:hyperlink r:id="rId42">
+      <w:hyperlink r:id="rId44">
         <w:r>
           <w:rPr>
             <w:u w:val="single"/>
@@ -2445,7 +2508,7 @@
         </w:rPr>
         <w:t xml:space="preserve">  ·  </w:t>
       </w:r>
-      <w:hyperlink r:id="rId43">
+      <w:hyperlink r:id="rId45">
         <w:r>
           <w:rPr>
             <w:u w:val="single"/>
@@ -2460,7 +2523,7 @@
         </w:rPr>
         <w:t xml:space="preserve">  ·  </w:t>
       </w:r>
-      <w:hyperlink r:id="rId44">
+      <w:hyperlink r:id="rId46">
         <w:r>
           <w:rPr>
             <w:u w:val="single"/>
@@ -2615,7 +2678,7 @@
         </w:rPr>
         <w:t xml:space="preserve">Sources: </w:t>
       </w:r>
-      <w:hyperlink r:id="rId45">
+      <w:hyperlink r:id="rId47">
         <w:r>
           <w:rPr>
             <w:u w:val="single"/>
@@ -2630,7 +2693,7 @@
         </w:rPr>
         <w:t xml:space="preserve">  ·  </w:t>
       </w:r>
-      <w:hyperlink r:id="rId46">
+      <w:hyperlink r:id="rId48">
         <w:r>
           <w:rPr>
             <w:u w:val="single"/>
@@ -2645,7 +2708,7 @@
         </w:rPr>
         <w:t xml:space="preserve">  ·  </w:t>
       </w:r>
-      <w:hyperlink r:id="rId47">
+      <w:hyperlink r:id="rId49">
         <w:r>
           <w:rPr>
             <w:u w:val="single"/>
@@ -2812,7 +2875,7 @@
         </w:rPr>
         <w:t xml:space="preserve">Sources: </w:t>
       </w:r>
-      <w:hyperlink r:id="rId48">
+      <w:hyperlink r:id="rId50">
         <w:r>
           <w:rPr>
             <w:u w:val="single"/>
@@ -2827,7 +2890,7 @@
         </w:rPr>
         <w:t xml:space="preserve">  ·  </w:t>
       </w:r>
-      <w:hyperlink r:id="rId49">
+      <w:hyperlink r:id="rId51">
         <w:r>
           <w:rPr>
             <w:u w:val="single"/>
@@ -2980,7 +3043,7 @@
         </w:rPr>
         <w:t xml:space="preserve">Sources: </w:t>
       </w:r>
-      <w:hyperlink r:id="rId50">
+      <w:hyperlink r:id="rId52">
         <w:r>
           <w:rPr>
             <w:u w:val="single"/>
@@ -2995,7 +3058,7 @@
         </w:rPr>
         <w:t xml:space="preserve">  ·  </w:t>
       </w:r>
-      <w:hyperlink r:id="rId51">
+      <w:hyperlink r:id="rId53">
         <w:r>
           <w:rPr>
             <w:u w:val="single"/>
@@ -3010,7 +3073,7 @@
         </w:rPr>
         <w:t xml:space="preserve">  ·  </w:t>
       </w:r>
-      <w:hyperlink r:id="rId52">
+      <w:hyperlink r:id="rId54">
         <w:r>
           <w:rPr>
             <w:u w:val="single"/>
@@ -3163,7 +3226,7 @@
         </w:rPr>
         <w:t xml:space="preserve">Sources: </w:t>
       </w:r>
-      <w:hyperlink r:id="rId53">
+      <w:hyperlink r:id="rId55">
         <w:r>
           <w:rPr>
             <w:u w:val="single"/>
@@ -3178,7 +3241,7 @@
         </w:rPr>
         <w:t xml:space="preserve">  ·  </w:t>
       </w:r>
-      <w:hyperlink r:id="rId54">
+      <w:hyperlink r:id="rId56">
         <w:r>
           <w:rPr>
             <w:u w:val="single"/>
@@ -3193,7 +3256,7 @@
         </w:rPr>
         <w:t xml:space="preserve">  ·  </w:t>
       </w:r>
-      <w:hyperlink r:id="rId55">
+      <w:hyperlink r:id="rId57">
         <w:r>
           <w:rPr>
             <w:u w:val="single"/>
@@ -3346,7 +3409,7 @@
         </w:rPr>
         <w:t xml:space="preserve">Sources: </w:t>
       </w:r>
-      <w:hyperlink r:id="rId56">
+      <w:hyperlink r:id="rId58">
         <w:r>
           <w:rPr>
             <w:u w:val="single"/>
@@ -3361,7 +3424,7 @@
         </w:rPr>
         <w:t xml:space="preserve">  ·  </w:t>
       </w:r>
-      <w:hyperlink r:id="rId57">
+      <w:hyperlink r:id="rId59">
         <w:r>
           <w:rPr>
             <w:u w:val="single"/>
@@ -3514,7 +3577,7 @@
         </w:rPr>
         <w:t xml:space="preserve">Sources: </w:t>
       </w:r>
-      <w:hyperlink r:id="rId58">
+      <w:hyperlink r:id="rId60">
         <w:r>
           <w:rPr>
             <w:u w:val="single"/>
@@ -3529,7 +3592,7 @@
         </w:rPr>
         <w:t xml:space="preserve">  ·  </w:t>
       </w:r>
-      <w:hyperlink r:id="rId59">
+      <w:hyperlink r:id="rId61">
         <w:r>
           <w:rPr>
             <w:u w:val="single"/>
@@ -3544,7 +3607,7 @@
         </w:rPr>
         <w:t xml:space="preserve">  ·  </w:t>
       </w:r>
-      <w:hyperlink r:id="rId60">
+      <w:hyperlink r:id="rId62">
         <w:r>
           <w:rPr>
             <w:u w:val="single"/>
@@ -3697,7 +3760,7 @@
         </w:rPr>
         <w:t xml:space="preserve">Sources: </w:t>
       </w:r>
-      <w:hyperlink r:id="rId61">
+      <w:hyperlink r:id="rId63">
         <w:r>
           <w:rPr>
             <w:u w:val="single"/>
@@ -3712,7 +3775,7 @@
         </w:rPr>
         <w:t xml:space="preserve">  ·  </w:t>
       </w:r>
-      <w:hyperlink r:id="rId62">
+      <w:hyperlink r:id="rId64">
         <w:r>
           <w:rPr>
             <w:u w:val="single"/>
@@ -3727,7 +3790,7 @@
         </w:rPr>
         <w:t xml:space="preserve">  ·  </w:t>
       </w:r>
-      <w:hyperlink r:id="rId63">
+      <w:hyperlink r:id="rId65">
         <w:r>
           <w:rPr>
             <w:u w:val="single"/>
@@ -3880,7 +3943,7 @@
         </w:rPr>
         <w:t xml:space="preserve">Sources: </w:t>
       </w:r>
-      <w:hyperlink r:id="rId64">
+      <w:hyperlink r:id="rId66">
         <w:r>
           <w:rPr>
             <w:u w:val="single"/>
@@ -3895,7 +3958,7 @@
         </w:rPr>
         <w:t xml:space="preserve">  ·  </w:t>
       </w:r>
-      <w:hyperlink r:id="rId65">
+      <w:hyperlink r:id="rId67">
         <w:r>
           <w:rPr>
             <w:u w:val="single"/>
@@ -3910,7 +3973,7 @@
         </w:rPr>
         <w:t xml:space="preserve">  ·  </w:t>
       </w:r>
-      <w:hyperlink r:id="rId66">
+      <w:hyperlink r:id="rId68">
         <w:r>
           <w:rPr>
             <w:u w:val="single"/>
@@ -4063,7 +4126,7 @@
         </w:rPr>
         <w:t xml:space="preserve">Sources: </w:t>
       </w:r>
-      <w:hyperlink r:id="rId67">
+      <w:hyperlink r:id="rId69">
         <w:r>
           <w:rPr>
             <w:u w:val="single"/>
@@ -4078,7 +4141,7 @@
         </w:rPr>
         <w:t xml:space="preserve">  ·  </w:t>
       </w:r>
-      <w:hyperlink r:id="rId68">
+      <w:hyperlink r:id="rId70">
         <w:r>
           <w:rPr>
             <w:u w:val="single"/>
@@ -4093,7 +4156,7 @@
         </w:rPr>
         <w:t xml:space="preserve">  ·  </w:t>
       </w:r>
-      <w:hyperlink r:id="rId69">
+      <w:hyperlink r:id="rId71">
         <w:r>
           <w:rPr>
             <w:u w:val="single"/>
@@ -4246,7 +4309,7 @@
         </w:rPr>
         <w:t xml:space="preserve">Sources: </w:t>
       </w:r>
-      <w:hyperlink r:id="rId70">
+      <w:hyperlink r:id="rId72">
         <w:r>
           <w:rPr>
             <w:u w:val="single"/>
@@ -4261,7 +4324,7 @@
         </w:rPr>
         <w:t xml:space="preserve">  ·  </w:t>
       </w:r>
-      <w:hyperlink r:id="rId71">
+      <w:hyperlink r:id="rId73">
         <w:r>
           <w:rPr>
             <w:u w:val="single"/>
@@ -4276,7 +4339,7 @@
         </w:rPr>
         <w:t xml:space="preserve">  ·  </w:t>
       </w:r>
-      <w:hyperlink r:id="rId72">
+      <w:hyperlink r:id="rId74">
         <w:r>
           <w:rPr>
             <w:u w:val="single"/>
@@ -4429,7 +4492,7 @@
         </w:rPr>
         <w:t xml:space="preserve">Sources: </w:t>
       </w:r>
-      <w:hyperlink r:id="rId73">
+      <w:hyperlink r:id="rId75">
         <w:r>
           <w:rPr>
             <w:u w:val="single"/>
@@ -4444,7 +4507,7 @@
         </w:rPr>
         <w:t xml:space="preserve">  ·  </w:t>
       </w:r>
-      <w:hyperlink r:id="rId74">
+      <w:hyperlink r:id="rId76">
         <w:r>
           <w:rPr>
             <w:u w:val="single"/>
@@ -4459,7 +4522,7 @@
         </w:rPr>
         <w:t xml:space="preserve">  ·  </w:t>
       </w:r>
-      <w:hyperlink r:id="rId75">
+      <w:hyperlink r:id="rId77">
         <w:r>
           <w:rPr>
             <w:u w:val="single"/>
@@ -4602,7 +4665,7 @@
         </w:rPr>
         <w:t xml:space="preserve">Sources: </w:t>
       </w:r>
-      <w:hyperlink r:id="rId76">
+      <w:hyperlink r:id="rId78">
         <w:r>
           <w:rPr>
             <w:u w:val="single"/>
@@ -4617,7 +4680,7 @@
         </w:rPr>
         <w:t xml:space="preserve">  ·  </w:t>
       </w:r>
-      <w:hyperlink r:id="rId77">
+      <w:hyperlink r:id="rId79">
         <w:r>
           <w:rPr>
             <w:u w:val="single"/>
@@ -4632,7 +4695,7 @@
         </w:rPr>
         <w:t xml:space="preserve">  ·  </w:t>
       </w:r>
-      <w:hyperlink r:id="rId78">
+      <w:hyperlink r:id="rId80">
         <w:r>
           <w:rPr>
             <w:u w:val="single"/>
@@ -4785,7 +4848,7 @@
         </w:rPr>
         <w:t xml:space="preserve">Sources: </w:t>
       </w:r>
-      <w:hyperlink r:id="rId79">
+      <w:hyperlink r:id="rId81">
         <w:r>
           <w:rPr>
             <w:u w:val="single"/>
@@ -4800,7 +4863,7 @@
         </w:rPr>
         <w:t xml:space="preserve">  ·  </w:t>
       </w:r>
-      <w:hyperlink r:id="rId80">
+      <w:hyperlink r:id="rId82">
         <w:r>
           <w:rPr>
             <w:u w:val="single"/>
@@ -4815,7 +4878,7 @@
         </w:rPr>
         <w:t xml:space="preserve">  ·  </w:t>
       </w:r>
-      <w:hyperlink r:id="rId81">
+      <w:hyperlink r:id="rId83">
         <w:r>
           <w:rPr>
             <w:u w:val="single"/>
@@ -4968,7 +5031,7 @@
         </w:rPr>
         <w:t xml:space="preserve">Sources: </w:t>
       </w:r>
-      <w:hyperlink r:id="rId82">
+      <w:hyperlink r:id="rId84">
         <w:r>
           <w:rPr>
             <w:u w:val="single"/>
@@ -4983,7 +5046,7 @@
         </w:rPr>
         <w:t xml:space="preserve">  ·  </w:t>
       </w:r>
-      <w:hyperlink r:id="rId83">
+      <w:hyperlink r:id="rId85">
         <w:r>
           <w:rPr>
             <w:u w:val="single"/>
@@ -5136,7 +5199,7 @@
         </w:rPr>
         <w:t xml:space="preserve">Sources: </w:t>
       </w:r>
-      <w:hyperlink r:id="rId84">
+      <w:hyperlink r:id="rId86">
         <w:r>
           <w:rPr>
             <w:u w:val="single"/>
@@ -5151,7 +5214,7 @@
         </w:rPr>
         <w:t xml:space="preserve">  ·  </w:t>
       </w:r>
-      <w:hyperlink r:id="rId85">
+      <w:hyperlink r:id="rId87">
         <w:r>
           <w:rPr>
             <w:u w:val="single"/>
@@ -5166,7 +5229,7 @@
         </w:rPr>
         <w:t xml:space="preserve">  ·  </w:t>
       </w:r>
-      <w:hyperlink r:id="rId86">
+      <w:hyperlink r:id="rId88">
         <w:r>
           <w:rPr>
             <w:u w:val="single"/>
@@ -5319,7 +5382,7 @@
         </w:rPr>
         <w:t xml:space="preserve">Sources: </w:t>
       </w:r>
-      <w:hyperlink r:id="rId87">
+      <w:hyperlink r:id="rId89">
         <w:r>
           <w:rPr>
             <w:u w:val="single"/>
@@ -5334,7 +5397,7 @@
         </w:rPr>
         <w:t xml:space="preserve">  ·  </w:t>
       </w:r>
-      <w:hyperlink r:id="rId88">
+      <w:hyperlink r:id="rId90">
         <w:r>
           <w:rPr>
             <w:u w:val="single"/>
@@ -5349,7 +5412,7 @@
         </w:rPr>
         <w:t xml:space="preserve">  ·  </w:t>
       </w:r>
-      <w:hyperlink r:id="rId89">
+      <w:hyperlink r:id="rId91">
         <w:r>
           <w:rPr>
             <w:u w:val="single"/>
@@ -5502,7 +5565,7 @@
         </w:rPr>
         <w:t xml:space="preserve">Sources: </w:t>
       </w:r>
-      <w:hyperlink r:id="rId90">
+      <w:hyperlink r:id="rId92">
         <w:r>
           <w:rPr>
             <w:u w:val="single"/>
@@ -5517,7 +5580,7 @@
         </w:rPr>
         <w:t xml:space="preserve">  ·  </w:t>
       </w:r>
-      <w:hyperlink r:id="rId91">
+      <w:hyperlink r:id="rId93">
         <w:r>
           <w:rPr>
             <w:u w:val="single"/>
@@ -5687,7 +5750,7 @@
         </w:rPr>
         <w:t xml:space="preserve">Sources: </w:t>
       </w:r>
-      <w:hyperlink r:id="rId92">
+      <w:hyperlink r:id="rId94">
         <w:r>
           <w:rPr>
             <w:u w:val="single"/>
@@ -5702,7 +5765,7 @@
         </w:rPr>
         <w:t xml:space="preserve">  ·  </w:t>
       </w:r>
-      <w:hyperlink r:id="rId93">
+      <w:hyperlink r:id="rId95">
         <w:r>
           <w:rPr>
             <w:u w:val="single"/>
@@ -5717,7 +5780,7 @@
         </w:rPr>
         <w:t xml:space="preserve">  ·  </w:t>
       </w:r>
-      <w:hyperlink r:id="rId94">
+      <w:hyperlink r:id="rId96">
         <w:r>
           <w:rPr>
             <w:u w:val="single"/>
@@ -5870,7 +5933,7 @@
         </w:rPr>
         <w:t xml:space="preserve">Sources: </w:t>
       </w:r>
-      <w:hyperlink r:id="rId95">
+      <w:hyperlink r:id="rId97">
         <w:r>
           <w:rPr>
             <w:u w:val="single"/>
@@ -5885,7 +5948,7 @@
         </w:rPr>
         <w:t xml:space="preserve">  ·  </w:t>
       </w:r>
-      <w:hyperlink r:id="rId96">
+      <w:hyperlink r:id="rId98">
         <w:r>
           <w:rPr>
             <w:u w:val="single"/>
@@ -5900,7 +5963,7 @@
         </w:rPr>
         <w:t xml:space="preserve">  ·  </w:t>
       </w:r>
-      <w:hyperlink r:id="rId97">
+      <w:hyperlink r:id="rId99">
         <w:r>
           <w:rPr>
             <w:u w:val="single"/>
@@ -6053,7 +6116,7 @@
         </w:rPr>
         <w:t xml:space="preserve">Sources: </w:t>
       </w:r>
-      <w:hyperlink r:id="rId98">
+      <w:hyperlink r:id="rId100">
         <w:r>
           <w:rPr>
             <w:u w:val="single"/>
@@ -6068,7 +6131,7 @@
         </w:rPr>
         <w:t xml:space="preserve">  ·  </w:t>
       </w:r>
-      <w:hyperlink r:id="rId99">
+      <w:hyperlink r:id="rId101">
         <w:r>
           <w:rPr>
             <w:u w:val="single"/>
@@ -6083,7 +6146,7 @@
         </w:rPr>
         <w:t xml:space="preserve">  ·  </w:t>
       </w:r>
-      <w:hyperlink r:id="rId100">
+      <w:hyperlink r:id="rId102">
         <w:r>
           <w:rPr>
             <w:u w:val="single"/>
@@ -6238,7 +6301,7 @@
         </w:rPr>
         <w:t xml:space="preserve">Sources: </w:t>
       </w:r>
-      <w:hyperlink r:id="rId101">
+      <w:hyperlink r:id="rId103">
         <w:r>
           <w:rPr>
             <w:u w:val="single"/>
@@ -6253,7 +6316,7 @@
         </w:rPr>
         <w:t xml:space="preserve">  ·  </w:t>
       </w:r>
-      <w:hyperlink r:id="rId102">
+      <w:hyperlink r:id="rId104">
         <w:r>
           <w:rPr>
             <w:u w:val="single"/>
@@ -6268,7 +6331,7 @@
         </w:rPr>
         <w:t xml:space="preserve">  ·  </w:t>
       </w:r>
-      <w:hyperlink r:id="rId103">
+      <w:hyperlink r:id="rId105">
         <w:r>
           <w:rPr>
             <w:u w:val="single"/>
@@ -6421,7 +6484,7 @@
         </w:rPr>
         <w:t xml:space="preserve">Sources: </w:t>
       </w:r>
-      <w:hyperlink r:id="rId104">
+      <w:hyperlink r:id="rId106">
         <w:r>
           <w:rPr>
             <w:u w:val="single"/>
@@ -6436,7 +6499,7 @@
         </w:rPr>
         <w:t xml:space="preserve">  ·  </w:t>
       </w:r>
-      <w:hyperlink r:id="rId105">
+      <w:hyperlink r:id="rId107">
         <w:r>
           <w:rPr>
             <w:u w:val="single"/>
@@ -6451,7 +6514,7 @@
         </w:rPr>
         <w:t xml:space="preserve">  ·  </w:t>
       </w:r>
-      <w:hyperlink r:id="rId106">
+      <w:hyperlink r:id="rId108">
         <w:r>
           <w:rPr>
             <w:u w:val="single"/>
@@ -6604,7 +6667,7 @@
         </w:rPr>
         <w:t xml:space="preserve">Sources: </w:t>
       </w:r>
-      <w:hyperlink r:id="rId107">
+      <w:hyperlink r:id="rId109">
         <w:r>
           <w:rPr>
             <w:u w:val="single"/>
@@ -6619,7 +6682,7 @@
         </w:rPr>
         <w:t xml:space="preserve">  ·  </w:t>
       </w:r>
-      <w:hyperlink r:id="rId108">
+      <w:hyperlink r:id="rId110">
         <w:r>
           <w:rPr>
             <w:u w:val="single"/>
@@ -6772,7 +6835,7 @@
         </w:rPr>
         <w:t xml:space="preserve">Sources: </w:t>
       </w:r>
-      <w:hyperlink r:id="rId109">
+      <w:hyperlink r:id="rId111">
         <w:r>
           <w:rPr>
             <w:u w:val="single"/>
@@ -6787,7 +6850,7 @@
         </w:rPr>
         <w:t xml:space="preserve">  ·  </w:t>
       </w:r>
-      <w:hyperlink r:id="rId110">
+      <w:hyperlink r:id="rId112">
         <w:r>
           <w:rPr>
             <w:u w:val="single"/>
@@ -6940,7 +7003,7 @@
         </w:rPr>
         <w:t xml:space="preserve">Sources: </w:t>
       </w:r>
-      <w:hyperlink r:id="rId111">
+      <w:hyperlink r:id="rId113">
         <w:r>
           <w:rPr>
             <w:u w:val="single"/>
@@ -6955,7 +7018,7 @@
         </w:rPr>
         <w:t xml:space="preserve">  ·  </w:t>
       </w:r>
-      <w:hyperlink r:id="rId112">
+      <w:hyperlink r:id="rId114">
         <w:r>
           <w:rPr>
             <w:u w:val="single"/>
@@ -7098,7 +7161,7 @@
         </w:rPr>
         <w:t xml:space="preserve">Sources: </w:t>
       </w:r>
-      <w:hyperlink r:id="rId113">
+      <w:hyperlink r:id="rId115">
         <w:r>
           <w:rPr>
             <w:u w:val="single"/>
@@ -7113,7 +7176,7 @@
         </w:rPr>
         <w:t xml:space="preserve">  ·  </w:t>
       </w:r>
-      <w:hyperlink r:id="rId114">
+      <w:hyperlink r:id="rId116">
         <w:r>
           <w:rPr>
             <w:u w:val="single"/>
@@ -7128,7 +7191,7 @@
         </w:rPr>
         <w:t xml:space="preserve">  ·  </w:t>
       </w:r>
-      <w:hyperlink r:id="rId115">
+      <w:hyperlink r:id="rId117">
         <w:r>
           <w:rPr>
             <w:u w:val="single"/>
@@ -7282,7 +7345,7 @@
         </w:rPr>
         <w:t xml:space="preserve">Sources: </w:t>
       </w:r>
-      <w:hyperlink r:id="rId116">
+      <w:hyperlink r:id="rId118">
         <w:r>
           <w:rPr>
             <w:u w:val="single"/>
@@ -7297,7 +7360,7 @@
         </w:rPr>
         <w:t xml:space="preserve">  ·  </w:t>
       </w:r>
-      <w:hyperlink r:id="rId117">
+      <w:hyperlink r:id="rId119">
         <w:r>
           <w:rPr>
             <w:u w:val="single"/>
@@ -7312,7 +7375,7 @@
         </w:rPr>
         <w:t xml:space="preserve">  ·  </w:t>
       </w:r>
-      <w:hyperlink r:id="rId118">
+      <w:hyperlink r:id="rId120">
         <w:r>
           <w:rPr>
             <w:u w:val="single"/>
@@ -7465,7 +7528,7 @@
         </w:rPr>
         <w:t xml:space="preserve">Sources: </w:t>
       </w:r>
-      <w:hyperlink r:id="rId119">
+      <w:hyperlink r:id="rId121">
         <w:r>
           <w:rPr>
             <w:u w:val="single"/>
@@ -7480,7 +7543,7 @@
         </w:rPr>
         <w:t xml:space="preserve">  ·  </w:t>
       </w:r>
-      <w:hyperlink r:id="rId120">
+      <w:hyperlink r:id="rId122">
         <w:r>
           <w:rPr>
             <w:u w:val="single"/>
@@ -7633,7 +7696,7 @@
         </w:rPr>
         <w:t xml:space="preserve">Sources: </w:t>
       </w:r>
-      <w:hyperlink r:id="rId121">
+      <w:hyperlink r:id="rId123">
         <w:r>
           <w:rPr>
             <w:u w:val="single"/>
@@ -7648,7 +7711,7 @@
         </w:rPr>
         <w:t xml:space="preserve">  ·  </w:t>
       </w:r>
-      <w:hyperlink r:id="rId122">
+      <w:hyperlink r:id="rId124">
         <w:r>
           <w:rPr>
             <w:u w:val="single"/>
@@ -7663,7 +7726,7 @@
         </w:rPr>
         <w:t xml:space="preserve">  ·  </w:t>
       </w:r>
-      <w:hyperlink r:id="rId123">
+      <w:hyperlink r:id="rId125">
         <w:r>
           <w:rPr>
             <w:u w:val="single"/>
@@ -7816,7 +7879,7 @@
         </w:rPr>
         <w:t xml:space="preserve">Sources: </w:t>
       </w:r>
-      <w:hyperlink r:id="rId124">
+      <w:hyperlink r:id="rId126">
         <w:r>
           <w:rPr>
             <w:u w:val="single"/>
@@ -7831,7 +7894,7 @@
         </w:rPr>
         <w:t xml:space="preserve">  ·  </w:t>
       </w:r>
-      <w:hyperlink r:id="rId125">
+      <w:hyperlink r:id="rId127">
         <w:r>
           <w:rPr>
             <w:u w:val="single"/>
@@ -7846,7 +7909,7 @@
         </w:rPr>
         <w:t xml:space="preserve">  ·  </w:t>
       </w:r>
-      <w:hyperlink r:id="rId126">
+      <w:hyperlink r:id="rId128">
         <w:r>
           <w:rPr>
             <w:u w:val="single"/>
@@ -7999,7 +8062,7 @@
         </w:rPr>
         <w:t xml:space="preserve">Sources: </w:t>
       </w:r>
-      <w:hyperlink r:id="rId127">
+      <w:hyperlink r:id="rId129">
         <w:r>
           <w:rPr>
             <w:u w:val="single"/>
@@ -8014,7 +8077,7 @@
         </w:rPr>
         <w:t xml:space="preserve">  ·  </w:t>
       </w:r>
-      <w:hyperlink r:id="rId128">
+      <w:hyperlink r:id="rId130">
         <w:r>
           <w:rPr>
             <w:u w:val="single"/>
@@ -8029,7 +8092,7 @@
         </w:rPr>
         <w:t xml:space="preserve">  ·  </w:t>
       </w:r>
-      <w:hyperlink r:id="rId129">
+      <w:hyperlink r:id="rId131">
         <w:r>
           <w:rPr>
             <w:u w:val="single"/>
@@ -8204,7 +8267,7 @@
         </w:rPr>
         <w:t xml:space="preserve">Sources: </w:t>
       </w:r>
-      <w:hyperlink r:id="rId130">
+      <w:hyperlink r:id="rId132">
         <w:r>
           <w:rPr>
             <w:u w:val="single"/>
@@ -8219,7 +8282,7 @@
         </w:rPr>
         <w:t xml:space="preserve">  ·  </w:t>
       </w:r>
-      <w:hyperlink r:id="rId131">
+      <w:hyperlink r:id="rId133">
         <w:r>
           <w:rPr>
             <w:u w:val="single"/>
@@ -8234,7 +8297,7 @@
         </w:rPr>
         <w:t xml:space="preserve">  ·  </w:t>
       </w:r>
-      <w:hyperlink r:id="rId132">
+      <w:hyperlink r:id="rId134">
         <w:r>
           <w:rPr>
             <w:u w:val="single"/>

</xml_diff>